<commit_message>
feat: Implement document generation for Surat Tugas and SPD with dynamic PPK assignment and pengikut birth dates, adding new controller and templates.
</commit_message>
<xml_diff>
--- a/templates/Form SPD FST (1).docx
+++ b/templates/Form SPD FST (1).docx
@@ -36,21 +36,7 @@
         <w:rPr>
           <w:sz w:val="20"/>
         </w:rPr>
-        <w:t xml:space="preserve">LAMPIRAN </w:t>
-      </w:r>
-      <w:proofErr w:type="gramStart"/>
-      <w:r>
-        <w:rPr>
-          <w:sz w:val="20"/>
-        </w:rPr>
-        <w:t>I :</w:t>
-      </w:r>
-      <w:proofErr w:type="gramEnd"/>
-      <w:r>
-        <w:rPr>
-          <w:sz w:val="20"/>
-        </w:rPr>
-        <w:t xml:space="preserve"> </w:t>
+        <w:t xml:space="preserve">LAMPIRAN I : </w:t>
       </w:r>
       <w:r>
         <w:rPr>
@@ -125,19 +111,11 @@
           <w:sz w:val="20"/>
         </w:rPr>
       </w:pPr>
-      <w:proofErr w:type="gramStart"/>
       <w:r>
         <w:rPr>
           <w:sz w:val="20"/>
         </w:rPr>
-        <w:t>NEGARA,  PEGAWAI</w:t>
-      </w:r>
-      <w:proofErr w:type="gramEnd"/>
-      <w:r>
-        <w:rPr>
-          <w:sz w:val="20"/>
-        </w:rPr>
-        <w:t xml:space="preserve"> NEGERI, DAN PEGAWAI TIDAK TETAP</w:t>
+        <w:t>NEGARA,  PEGAWAI NEGERI, DAN PEGAWAI TIDAK TETAP</w:t>
       </w:r>
     </w:p>
     <w:p>
@@ -245,7 +223,6 @@
                 <w:szCs w:val="24"/>
               </w:rPr>
             </w:pPr>
-            <w:proofErr w:type="gramStart"/>
             <w:r>
               <w:rPr>
                 <w:b/>
@@ -269,16 +246,7 @@
                 <w:sz w:val="28"/>
                 <w:szCs w:val="28"/>
               </w:rPr>
-              <w:t>IN</w:t>
-            </w:r>
-            <w:proofErr w:type="gramEnd"/>
-            <w:r>
-              <w:rPr>
-                <w:b/>
-                <w:sz w:val="28"/>
-                <w:szCs w:val="28"/>
-              </w:rPr>
-              <w:t xml:space="preserve"> ) IMAM BONJOL PADANG</w:t>
+              <w:t>IN ) IMAM BONJOL PADANG</w:t>
             </w:r>
           </w:p>
         </w:tc>
@@ -335,15 +303,7 @@
               <w:t xml:space="preserve">Nomor           : </w:t>
             </w:r>
             <w:r>
-              <w:t>{</w:t>
-            </w:r>
-            <w:proofErr w:type="spellStart"/>
-            <w:r>
-              <w:t>spd_nomor</w:t>
-            </w:r>
-            <w:proofErr w:type="spellEnd"/>
-            <w:r>
-              <w:t>}</w:t>
+              <w:t>{spd_nomor}</w:t>
             </w:r>
           </w:p>
         </w:tc>
@@ -374,49 +334,7 @@
               <w:rPr>
                 <w:sz w:val="16"/>
               </w:rPr>
-              <w:t xml:space="preserve">Jalan Mahmud Yunus </w:t>
-            </w:r>
-            <w:proofErr w:type="spellStart"/>
-            <w:r>
-              <w:rPr>
-                <w:sz w:val="16"/>
-              </w:rPr>
-              <w:t>Lubuk</w:t>
-            </w:r>
-            <w:proofErr w:type="spellEnd"/>
-            <w:r>
-              <w:rPr>
-                <w:sz w:val="16"/>
-              </w:rPr>
-              <w:t xml:space="preserve"> </w:t>
-            </w:r>
-            <w:proofErr w:type="spellStart"/>
-            <w:r>
-              <w:rPr>
-                <w:sz w:val="16"/>
-              </w:rPr>
-              <w:t>Lintah</w:t>
-            </w:r>
-            <w:proofErr w:type="spellEnd"/>
-            <w:r>
-              <w:rPr>
-                <w:sz w:val="16"/>
-              </w:rPr>
-              <w:t xml:space="preserve"> Padang Telp.0751 - 24435-35711-20923(</w:t>
-            </w:r>
-            <w:proofErr w:type="spellStart"/>
-            <w:r>
-              <w:rPr>
-                <w:sz w:val="16"/>
-              </w:rPr>
-              <w:t>fak</w:t>
-            </w:r>
-            <w:proofErr w:type="spellEnd"/>
-            <w:r>
-              <w:rPr>
-                <w:sz w:val="16"/>
-              </w:rPr>
-              <w:t>)</w:t>
+              <w:t>Jalan Mahmud Yunus Lubuk Lintah Padang Telp.0751 - 24435-35711-20923(fak)</w:t>
             </w:r>
           </w:p>
         </w:tc>
@@ -535,47 +453,13 @@
                 <w:szCs w:val="22"/>
               </w:rPr>
             </w:pPr>
-            <w:proofErr w:type="spellStart"/>
-            <w:r>
-              <w:rPr>
-                <w:sz w:val="22"/>
-                <w:szCs w:val="22"/>
-              </w:rPr>
-              <w:t>Pejabat</w:t>
-            </w:r>
-            <w:proofErr w:type="spellEnd"/>
-            <w:r>
-              <w:rPr>
-                <w:sz w:val="22"/>
-                <w:szCs w:val="22"/>
-              </w:rPr>
-              <w:t xml:space="preserve"> </w:t>
-            </w:r>
-            <w:proofErr w:type="spellStart"/>
-            <w:r>
-              <w:rPr>
-                <w:sz w:val="22"/>
-                <w:szCs w:val="22"/>
-              </w:rPr>
-              <w:t>Pembuat</w:t>
-            </w:r>
-            <w:proofErr w:type="spellEnd"/>
-            <w:r>
-              <w:rPr>
-                <w:sz w:val="22"/>
-                <w:szCs w:val="22"/>
-              </w:rPr>
-              <w:t xml:space="preserve"> </w:t>
-            </w:r>
-            <w:proofErr w:type="spellStart"/>
-            <w:r>
-              <w:rPr>
-                <w:sz w:val="22"/>
-                <w:szCs w:val="22"/>
-              </w:rPr>
-              <w:t>Komitmen</w:t>
-            </w:r>
-            <w:proofErr w:type="spellEnd"/>
+            <w:r>
+              <w:rPr>
+                <w:sz w:val="22"/>
+                <w:szCs w:val="22"/>
+              </w:rPr>
+              <w:t>Pejabat Pembuat Komitmen</w:t>
+            </w:r>
           </w:p>
         </w:tc>
         <w:tc>
@@ -601,23 +485,7 @@
                 <w:sz w:val="22"/>
                 <w:szCs w:val="22"/>
               </w:rPr>
-              <w:t>{</w:t>
-            </w:r>
-            <w:proofErr w:type="spellStart"/>
-            <w:r>
-              <w:rPr>
-                <w:sz w:val="22"/>
-                <w:szCs w:val="22"/>
-              </w:rPr>
-              <w:t>ppk_name</w:t>
-            </w:r>
-            <w:proofErr w:type="spellEnd"/>
-            <w:r>
-              <w:rPr>
-                <w:sz w:val="22"/>
-                <w:szCs w:val="22"/>
-              </w:rPr>
-              <w:t>}</w:t>
+              <w:t>{ppk_name}</w:t>
             </w:r>
           </w:p>
         </w:tc>
@@ -701,23 +569,7 @@
                 <w:sz w:val="22"/>
                 <w:szCs w:val="22"/>
               </w:rPr>
-              <w:t>{</w:t>
-            </w:r>
-            <w:proofErr w:type="spellStart"/>
-            <w:r>
-              <w:rPr>
-                <w:sz w:val="22"/>
-                <w:szCs w:val="22"/>
-              </w:rPr>
-              <w:t>pegawai_nama_nip</w:t>
-            </w:r>
-            <w:proofErr w:type="spellEnd"/>
-            <w:r>
-              <w:rPr>
-                <w:sz w:val="22"/>
-                <w:szCs w:val="22"/>
-              </w:rPr>
-              <w:t>}</w:t>
+              <w:t>{pegawai_nama_nip}</w:t>
             </w:r>
           </w:p>
         </w:tc>
@@ -768,23 +620,12 @@
                 <w:szCs w:val="22"/>
               </w:rPr>
             </w:pPr>
-            <w:proofErr w:type="spellStart"/>
-            <w:proofErr w:type="gramStart"/>
-            <w:r>
-              <w:rPr>
-                <w:sz w:val="22"/>
-                <w:szCs w:val="22"/>
-              </w:rPr>
-              <w:t>a.Pangkat</w:t>
-            </w:r>
-            <w:proofErr w:type="spellEnd"/>
-            <w:proofErr w:type="gramEnd"/>
-            <w:r>
-              <w:rPr>
-                <w:sz w:val="22"/>
-                <w:szCs w:val="22"/>
-              </w:rPr>
-              <w:t xml:space="preserve"> dan gologan </w:t>
+            <w:r>
+              <w:rPr>
+                <w:sz w:val="22"/>
+                <w:szCs w:val="22"/>
+              </w:rPr>
+              <w:t xml:space="preserve">a.Pangkat dan gologan </w:t>
             </w:r>
           </w:p>
         </w:tc>
@@ -872,33 +713,13 @@
                 <w:szCs w:val="22"/>
               </w:rPr>
             </w:pPr>
-            <w:proofErr w:type="spellStart"/>
-            <w:proofErr w:type="gramStart"/>
-            <w:r>
-              <w:rPr>
-                <w:sz w:val="22"/>
-                <w:szCs w:val="22"/>
-              </w:rPr>
-              <w:t>b.Jabatan</w:t>
-            </w:r>
-            <w:proofErr w:type="spellEnd"/>
-            <w:proofErr w:type="gramEnd"/>
-            <w:r>
-              <w:rPr>
-                <w:sz w:val="22"/>
-                <w:szCs w:val="22"/>
-              </w:rPr>
-              <w:t>/</w:t>
-            </w:r>
-            <w:proofErr w:type="spellStart"/>
-            <w:r>
-              <w:rPr>
-                <w:sz w:val="22"/>
-                <w:szCs w:val="22"/>
-              </w:rPr>
-              <w:t>Instansi</w:t>
-            </w:r>
-            <w:proofErr w:type="spellEnd"/>
+            <w:r>
+              <w:rPr>
+                <w:sz w:val="22"/>
+                <w:szCs w:val="22"/>
+              </w:rPr>
+              <w:t>b.Jabatan/Instansi</w:t>
+            </w:r>
           </w:p>
         </w:tc>
         <w:tc>
@@ -935,23 +756,7 @@
                 <w:sz w:val="22"/>
                 <w:szCs w:val="22"/>
               </w:rPr>
-              <w:t>{</w:t>
-            </w:r>
-            <w:proofErr w:type="spellStart"/>
-            <w:r>
-              <w:rPr>
-                <w:sz w:val="22"/>
-                <w:szCs w:val="22"/>
-              </w:rPr>
-              <w:t>jabatan_instansi</w:t>
-            </w:r>
-            <w:proofErr w:type="spellEnd"/>
-            <w:r>
-              <w:rPr>
-                <w:sz w:val="22"/>
-                <w:szCs w:val="22"/>
-              </w:rPr>
-              <w:t>}</w:t>
+              <w:t>{jabatan_instansi}</w:t>
             </w:r>
           </w:p>
         </w:tc>
@@ -1022,7 +827,6 @@
                 <w:szCs w:val="22"/>
               </w:rPr>
             </w:pPr>
-            <w:proofErr w:type="gramStart"/>
             <w:r>
               <w:rPr>
                 <w:sz w:val="22"/>
@@ -1042,24 +846,7 @@
                 <w:sz w:val="22"/>
                 <w:szCs w:val="22"/>
               </w:rPr>
-              <w:t>{</w:t>
-            </w:r>
-            <w:proofErr w:type="spellStart"/>
-            <w:proofErr w:type="gramEnd"/>
-            <w:r>
-              <w:rPr>
-                <w:sz w:val="22"/>
-                <w:szCs w:val="22"/>
-              </w:rPr>
-              <w:t>tingkat_biaya</w:t>
-            </w:r>
-            <w:proofErr w:type="spellEnd"/>
-            <w:r>
-              <w:rPr>
-                <w:sz w:val="22"/>
-                <w:szCs w:val="22"/>
-              </w:rPr>
-              <w:t>}</w:t>
+              <w:t>{tingkat_biaya}</w:t>
             </w:r>
           </w:p>
         </w:tc>
@@ -1115,23 +902,7 @@
                 <w:sz w:val="22"/>
                 <w:szCs w:val="22"/>
               </w:rPr>
-              <w:t xml:space="preserve">Maksud </w:t>
-            </w:r>
-            <w:proofErr w:type="spellStart"/>
-            <w:r>
-              <w:rPr>
-                <w:sz w:val="22"/>
-                <w:szCs w:val="22"/>
-              </w:rPr>
-              <w:t>Perjalanan</w:t>
-            </w:r>
-            <w:proofErr w:type="spellEnd"/>
-            <w:r>
-              <w:rPr>
-                <w:sz w:val="22"/>
-                <w:szCs w:val="22"/>
-              </w:rPr>
-              <w:t xml:space="preserve"> Dinas </w:t>
+              <w:t xml:space="preserve">Maksud Perjalanan Dinas </w:t>
             </w:r>
           </w:p>
         </w:tc>
@@ -1163,25 +934,7 @@
                 <w:sz w:val="22"/>
                 <w:szCs w:val="22"/>
               </w:rPr>
-              <w:t>{</w:t>
-            </w:r>
-            <w:proofErr w:type="spellStart"/>
-            <w:r>
-              <w:rPr>
-                <w:rFonts w:ascii="Times New Roman" w:hAnsi="Times New Roman"/>
-                <w:sz w:val="22"/>
-                <w:szCs w:val="22"/>
-              </w:rPr>
-              <w:t>maksud_dinas</w:t>
-            </w:r>
-            <w:proofErr w:type="spellEnd"/>
-            <w:r>
-              <w:rPr>
-                <w:rFonts w:ascii="Times New Roman" w:hAnsi="Times New Roman"/>
-                <w:sz w:val="22"/>
-                <w:szCs w:val="22"/>
-              </w:rPr>
-              <w:t>}</w:t>
+              <w:t>{maksud_dinas}</w:t>
             </w:r>
           </w:p>
         </w:tc>
@@ -1237,39 +990,7 @@
                 <w:sz w:val="22"/>
                 <w:szCs w:val="22"/>
               </w:rPr>
-              <w:t xml:space="preserve">Alat </w:t>
-            </w:r>
-            <w:proofErr w:type="spellStart"/>
-            <w:r>
-              <w:rPr>
-                <w:sz w:val="22"/>
-                <w:szCs w:val="22"/>
-              </w:rPr>
-              <w:t>angkutan</w:t>
-            </w:r>
-            <w:proofErr w:type="spellEnd"/>
-            <w:r>
-              <w:rPr>
-                <w:sz w:val="22"/>
-                <w:szCs w:val="22"/>
-              </w:rPr>
-              <w:t xml:space="preserve"> yang </w:t>
-            </w:r>
-            <w:proofErr w:type="spellStart"/>
-            <w:r>
-              <w:rPr>
-                <w:sz w:val="22"/>
-                <w:szCs w:val="22"/>
-              </w:rPr>
-              <w:t>dipergunakan</w:t>
-            </w:r>
-            <w:proofErr w:type="spellEnd"/>
-            <w:r>
-              <w:rPr>
-                <w:sz w:val="22"/>
-                <w:szCs w:val="22"/>
-              </w:rPr>
-              <w:t xml:space="preserve"> </w:t>
+              <w:t xml:space="preserve">Alat angkutan yang dipergunakan </w:t>
             </w:r>
           </w:p>
         </w:tc>
@@ -1297,23 +1018,7 @@
                 <w:sz w:val="22"/>
                 <w:szCs w:val="22"/>
               </w:rPr>
-              <w:t>{</w:t>
-            </w:r>
-            <w:proofErr w:type="spellStart"/>
-            <w:r>
-              <w:rPr>
-                <w:sz w:val="22"/>
-                <w:szCs w:val="22"/>
-              </w:rPr>
-              <w:t>alat_angkut</w:t>
-            </w:r>
-            <w:proofErr w:type="spellEnd"/>
-            <w:r>
-              <w:rPr>
-                <w:sz w:val="22"/>
-                <w:szCs w:val="22"/>
-              </w:rPr>
-              <w:t>}</w:t>
+              <w:t>{alat_angkut}</w:t>
             </w:r>
           </w:p>
         </w:tc>
@@ -1369,39 +1074,7 @@
                 <w:sz w:val="22"/>
                 <w:szCs w:val="22"/>
               </w:rPr>
-              <w:t xml:space="preserve">a. </w:t>
-            </w:r>
-            <w:proofErr w:type="spellStart"/>
-            <w:r>
-              <w:rPr>
-                <w:sz w:val="22"/>
-                <w:szCs w:val="22"/>
-              </w:rPr>
-              <w:t>Tempat</w:t>
-            </w:r>
-            <w:proofErr w:type="spellEnd"/>
-            <w:r>
-              <w:rPr>
-                <w:sz w:val="22"/>
-                <w:szCs w:val="22"/>
-              </w:rPr>
-              <w:t xml:space="preserve"> </w:t>
-            </w:r>
-            <w:proofErr w:type="spellStart"/>
-            <w:r>
-              <w:rPr>
-                <w:sz w:val="22"/>
-                <w:szCs w:val="22"/>
-              </w:rPr>
-              <w:t>berangkat</w:t>
-            </w:r>
-            <w:proofErr w:type="spellEnd"/>
-            <w:r>
-              <w:rPr>
-                <w:sz w:val="22"/>
-                <w:szCs w:val="22"/>
-              </w:rPr>
-              <w:t xml:space="preserve"> </w:t>
+              <w:t xml:space="preserve">a. Tempat berangkat </w:t>
             </w:r>
           </w:p>
           <w:p>
@@ -1417,39 +1090,7 @@
                 <w:sz w:val="22"/>
                 <w:szCs w:val="22"/>
               </w:rPr>
-              <w:t xml:space="preserve">b. </w:t>
-            </w:r>
-            <w:proofErr w:type="spellStart"/>
-            <w:r>
-              <w:rPr>
-                <w:sz w:val="22"/>
-                <w:szCs w:val="22"/>
-              </w:rPr>
-              <w:t>Tempat</w:t>
-            </w:r>
-            <w:proofErr w:type="spellEnd"/>
-            <w:r>
-              <w:rPr>
-                <w:sz w:val="22"/>
-                <w:szCs w:val="22"/>
-              </w:rPr>
-              <w:t xml:space="preserve"> </w:t>
-            </w:r>
-            <w:proofErr w:type="spellStart"/>
-            <w:r>
-              <w:rPr>
-                <w:sz w:val="22"/>
-                <w:szCs w:val="22"/>
-              </w:rPr>
-              <w:t>tujuan</w:t>
-            </w:r>
-            <w:proofErr w:type="spellEnd"/>
-            <w:r>
-              <w:rPr>
-                <w:sz w:val="22"/>
-                <w:szCs w:val="22"/>
-              </w:rPr>
-              <w:t xml:space="preserve"> </w:t>
+              <w:t xml:space="preserve">b. Tempat tujuan </w:t>
             </w:r>
           </w:p>
         </w:tc>
@@ -1484,23 +1125,7 @@
                 <w:sz w:val="22"/>
                 <w:szCs w:val="22"/>
               </w:rPr>
-              <w:t>{</w:t>
-            </w:r>
-            <w:proofErr w:type="spellStart"/>
-            <w:r>
-              <w:rPr>
-                <w:sz w:val="22"/>
-                <w:szCs w:val="22"/>
-              </w:rPr>
-              <w:t>tempat_berangkat</w:t>
-            </w:r>
-            <w:proofErr w:type="spellEnd"/>
-            <w:r>
-              <w:rPr>
-                <w:sz w:val="22"/>
-                <w:szCs w:val="22"/>
-              </w:rPr>
-              <w:t>}</w:t>
+              <w:t>{tempat_berangkat}</w:t>
             </w:r>
           </w:p>
           <w:p>
@@ -1523,23 +1148,7 @@
                 <w:sz w:val="22"/>
                 <w:szCs w:val="22"/>
               </w:rPr>
-              <w:t>{</w:t>
-            </w:r>
-            <w:proofErr w:type="spellStart"/>
-            <w:r>
-              <w:rPr>
-                <w:sz w:val="22"/>
-                <w:szCs w:val="22"/>
-              </w:rPr>
-              <w:t>tempat_tujuan</w:t>
-            </w:r>
-            <w:proofErr w:type="spellEnd"/>
-            <w:r>
-              <w:rPr>
-                <w:sz w:val="22"/>
-                <w:szCs w:val="22"/>
-              </w:rPr>
-              <w:t>}</w:t>
+              <w:t>{tempat_tujuan}</w:t>
             </w:r>
           </w:p>
         </w:tc>
@@ -1631,87 +1240,7 @@
                 <w:sz w:val="22"/>
                 <w:szCs w:val="22"/>
               </w:rPr>
-              <w:t xml:space="preserve">c. </w:t>
-            </w:r>
-            <w:proofErr w:type="spellStart"/>
-            <w:r>
-              <w:rPr>
-                <w:sz w:val="22"/>
-                <w:szCs w:val="22"/>
-              </w:rPr>
-              <w:t>Tanggal</w:t>
-            </w:r>
-            <w:proofErr w:type="spellEnd"/>
-            <w:r>
-              <w:rPr>
-                <w:sz w:val="22"/>
-                <w:szCs w:val="22"/>
-              </w:rPr>
-              <w:t xml:space="preserve"> harus </w:t>
-            </w:r>
-            <w:proofErr w:type="spellStart"/>
-            <w:r>
-              <w:rPr>
-                <w:sz w:val="22"/>
-                <w:szCs w:val="22"/>
-              </w:rPr>
-              <w:t>kembali</w:t>
-            </w:r>
-            <w:proofErr w:type="spellEnd"/>
-            <w:r>
-              <w:rPr>
-                <w:sz w:val="22"/>
-                <w:szCs w:val="22"/>
-              </w:rPr>
-              <w:t>/</w:t>
-            </w:r>
-            <w:proofErr w:type="spellStart"/>
-            <w:r>
-              <w:rPr>
-                <w:sz w:val="22"/>
-                <w:szCs w:val="22"/>
-              </w:rPr>
-              <w:t>tiba</w:t>
-            </w:r>
-            <w:proofErr w:type="spellEnd"/>
-            <w:r>
-              <w:rPr>
-                <w:sz w:val="22"/>
-                <w:szCs w:val="22"/>
-              </w:rPr>
-              <w:t xml:space="preserve"> di </w:t>
-            </w:r>
-            <w:proofErr w:type="spellStart"/>
-            <w:r>
-              <w:rPr>
-                <w:sz w:val="22"/>
-                <w:szCs w:val="22"/>
-              </w:rPr>
-              <w:t>tempat</w:t>
-            </w:r>
-            <w:proofErr w:type="spellEnd"/>
-            <w:r>
-              <w:rPr>
-                <w:sz w:val="22"/>
-                <w:szCs w:val="22"/>
-              </w:rPr>
-              <w:t xml:space="preserve"> </w:t>
-            </w:r>
-            <w:proofErr w:type="spellStart"/>
-            <w:r>
-              <w:rPr>
-                <w:sz w:val="22"/>
-                <w:szCs w:val="22"/>
-              </w:rPr>
-              <w:t>baru</w:t>
-            </w:r>
-            <w:proofErr w:type="spellEnd"/>
-            <w:r>
-              <w:rPr>
-                <w:sz w:val="22"/>
-                <w:szCs w:val="22"/>
-              </w:rPr>
-              <w:t>*)</w:t>
+              <w:t>c. Tanggal harus kembali/tiba di tempat baru*)</w:t>
             </w:r>
           </w:p>
         </w:tc>
@@ -1746,33 +1275,8 @@
                 <w:sz w:val="22"/>
                 <w:szCs w:val="22"/>
               </w:rPr>
-              <w:t>{</w:t>
-            </w:r>
-            <w:proofErr w:type="spellStart"/>
-            <w:r>
-              <w:rPr>
-                <w:sz w:val="22"/>
-                <w:szCs w:val="22"/>
-              </w:rPr>
-              <w:t>lama_hari</w:t>
-            </w:r>
-            <w:proofErr w:type="spellEnd"/>
-            <w:r>
-              <w:rPr>
-                <w:sz w:val="22"/>
-                <w:szCs w:val="22"/>
-              </w:rPr>
-              <w:t xml:space="preserve">} </w:t>
-            </w:r>
-            <w:proofErr w:type="spellStart"/>
-            <w:r>
-              <w:rPr>
-                <w:sz w:val="22"/>
-                <w:szCs w:val="22"/>
-              </w:rPr>
-              <w:t>hari</w:t>
-            </w:r>
-            <w:proofErr w:type="spellEnd"/>
+              <w:t>{lama_hari} hari</w:t>
+            </w:r>
           </w:p>
           <w:p>
             <w:pPr>
@@ -1794,23 +1298,7 @@
                 <w:sz w:val="22"/>
                 <w:szCs w:val="22"/>
               </w:rPr>
-              <w:t>{</w:t>
-            </w:r>
-            <w:proofErr w:type="spellStart"/>
-            <w:r>
-              <w:rPr>
-                <w:sz w:val="22"/>
-                <w:szCs w:val="22"/>
-              </w:rPr>
-              <w:t>tgl_berangkat</w:t>
-            </w:r>
-            <w:proofErr w:type="spellEnd"/>
-            <w:r>
-              <w:rPr>
-                <w:sz w:val="22"/>
-                <w:szCs w:val="22"/>
-              </w:rPr>
-              <w:t>}</w:t>
+              <w:t>{tgl_berangkat}</w:t>
             </w:r>
           </w:p>
           <w:p>
@@ -1833,23 +1321,7 @@
                 <w:sz w:val="22"/>
                 <w:szCs w:val="22"/>
               </w:rPr>
-              <w:t>{</w:t>
-            </w:r>
-            <w:proofErr w:type="spellStart"/>
-            <w:r>
-              <w:rPr>
-                <w:sz w:val="22"/>
-                <w:szCs w:val="22"/>
-              </w:rPr>
-              <w:t>tgl_kembali</w:t>
-            </w:r>
-            <w:proofErr w:type="spellEnd"/>
-            <w:r>
-              <w:rPr>
-                <w:sz w:val="22"/>
-                <w:szCs w:val="22"/>
-              </w:rPr>
-              <w:t>}</w:t>
+              <w:t>{tgl_kembali}</w:t>
             </w:r>
           </w:p>
         </w:tc>
@@ -1898,21 +1370,12 @@
                 <w:szCs w:val="22"/>
               </w:rPr>
             </w:pPr>
-            <w:proofErr w:type="gramStart"/>
-            <w:r>
-              <w:rPr>
-                <w:sz w:val="22"/>
-                <w:szCs w:val="22"/>
-              </w:rPr>
-              <w:t>Pengikut :</w:t>
-            </w:r>
-            <w:proofErr w:type="gramEnd"/>
-            <w:r>
-              <w:rPr>
-                <w:sz w:val="22"/>
-                <w:szCs w:val="22"/>
-              </w:rPr>
-              <w:t xml:space="preserve">             N a m a</w:t>
+            <w:r>
+              <w:rPr>
+                <w:sz w:val="22"/>
+                <w:szCs w:val="22"/>
+              </w:rPr>
+              <w:t>Pengikut :             N a m a</w:t>
             </w:r>
           </w:p>
         </w:tc>
@@ -1934,21 +1397,12 @@
                 <w:szCs w:val="22"/>
               </w:rPr>
             </w:pPr>
-            <w:proofErr w:type="spellStart"/>
-            <w:r>
-              <w:rPr>
-                <w:sz w:val="22"/>
-                <w:szCs w:val="22"/>
-              </w:rPr>
-              <w:t>Tanggal</w:t>
-            </w:r>
-            <w:proofErr w:type="spellEnd"/>
-            <w:r>
-              <w:rPr>
-                <w:sz w:val="22"/>
-                <w:szCs w:val="22"/>
-              </w:rPr>
-              <w:t xml:space="preserve"> Lahir</w:t>
+            <w:r>
+              <w:rPr>
+                <w:sz w:val="22"/>
+                <w:szCs w:val="22"/>
+              </w:rPr>
+              <w:t>Tanggal Lahir</w:t>
             </w:r>
           </w:p>
         </w:tc>
@@ -1970,7 +1424,6 @@
                 <w:szCs w:val="22"/>
               </w:rPr>
             </w:pPr>
-            <w:proofErr w:type="spellStart"/>
             <w:r>
               <w:rPr>
                 <w:sz w:val="22"/>
@@ -1978,7 +1431,6 @@
               </w:rPr>
               <w:t>Keterangan</w:t>
             </w:r>
-            <w:proofErr w:type="spellEnd"/>
           </w:p>
         </w:tc>
       </w:tr>
@@ -2040,23 +1492,7 @@
                 <w:sz w:val="22"/>
                 <w:szCs w:val="22"/>
               </w:rPr>
-              <w:t>{#pengikut_</w:t>
-            </w:r>
-            <w:proofErr w:type="gramStart"/>
-            <w:r>
-              <w:rPr>
-                <w:sz w:val="22"/>
-                <w:szCs w:val="22"/>
-              </w:rPr>
-              <w:t>loop}{</w:t>
-            </w:r>
-            <w:proofErr w:type="gramEnd"/>
-            <w:r>
-              <w:rPr>
-                <w:sz w:val="22"/>
-                <w:szCs w:val="22"/>
-              </w:rPr>
-              <w:t>pengikut_nama}</w:t>
+              <w:t>{#pengikut_loop}{pengikut_nama}</w:t>
             </w:r>
           </w:p>
         </w:tc>
@@ -2091,23 +1527,7 @@
                 <w:sz w:val="22"/>
                 <w:szCs w:val="22"/>
               </w:rPr>
-              <w:t>{</w:t>
-            </w:r>
-            <w:proofErr w:type="spellStart"/>
-            <w:r>
-              <w:rPr>
-                <w:sz w:val="22"/>
-                <w:szCs w:val="22"/>
-              </w:rPr>
-              <w:t>pengikut_tgl_lahir</w:t>
-            </w:r>
-            <w:proofErr w:type="spellEnd"/>
-            <w:r>
-              <w:rPr>
-                <w:sz w:val="22"/>
-                <w:szCs w:val="22"/>
-              </w:rPr>
-              <w:t>}</w:t>
+              <w:t>{pengikut_tgl_lahir}</w:t>
             </w:r>
           </w:p>
         </w:tc>
@@ -2141,55 +1561,7 @@
                 <w:sz w:val="22"/>
                 <w:szCs w:val="22"/>
               </w:rPr>
-              <w:t>{</w:t>
-            </w:r>
-            <w:proofErr w:type="spellStart"/>
-            <w:r>
-              <w:rPr>
-                <w:sz w:val="22"/>
-                <w:szCs w:val="22"/>
-              </w:rPr>
-              <w:t>pengikut_</w:t>
-            </w:r>
-            <w:proofErr w:type="gramStart"/>
-            <w:r>
-              <w:rPr>
-                <w:sz w:val="22"/>
-                <w:szCs w:val="22"/>
-              </w:rPr>
-              <w:t>ket</w:t>
-            </w:r>
-            <w:proofErr w:type="spellEnd"/>
-            <w:r>
-              <w:rPr>
-                <w:sz w:val="22"/>
-                <w:szCs w:val="22"/>
-              </w:rPr>
-              <w:t>}{</w:t>
-            </w:r>
-            <w:proofErr w:type="gramEnd"/>
-            <w:r>
-              <w:rPr>
-                <w:sz w:val="22"/>
-                <w:szCs w:val="22"/>
-              </w:rPr>
-              <w:t>/</w:t>
-            </w:r>
-            <w:proofErr w:type="spellStart"/>
-            <w:r>
-              <w:rPr>
-                <w:sz w:val="22"/>
-                <w:szCs w:val="22"/>
-              </w:rPr>
-              <w:t>pengikut_loop</w:t>
-            </w:r>
-            <w:proofErr w:type="spellEnd"/>
-            <w:r>
-              <w:rPr>
-                <w:sz w:val="22"/>
-                <w:szCs w:val="22"/>
-              </w:rPr>
-              <w:t>}</w:t>
+              <w:t>{pengikut_ket}{/pengikut_loop}</w:t>
             </w:r>
           </w:p>
         </w:tc>
@@ -2404,21 +1776,12 @@
                 <w:szCs w:val="22"/>
               </w:rPr>
             </w:pPr>
-            <w:proofErr w:type="spellStart"/>
-            <w:r>
-              <w:rPr>
-                <w:sz w:val="22"/>
-                <w:szCs w:val="22"/>
-              </w:rPr>
-              <w:t>Keterangan</w:t>
-            </w:r>
-            <w:proofErr w:type="spellEnd"/>
-            <w:r>
-              <w:rPr>
-                <w:sz w:val="22"/>
-                <w:szCs w:val="22"/>
-              </w:rPr>
-              <w:t xml:space="preserve"> Lain-lain</w:t>
+            <w:r>
+              <w:rPr>
+                <w:sz w:val="22"/>
+                <w:szCs w:val="22"/>
+              </w:rPr>
+              <w:t>Keterangan Lain-lain</w:t>
             </w:r>
           </w:p>
         </w:tc>
@@ -2613,29 +1976,15 @@
         </w:rPr>
         <w:t xml:space="preserve">anggal             : </w:t>
       </w:r>
+      <w:bookmarkStart w:id="0" w:name="_Hlk216760694"/>
       <w:r>
         <w:rPr>
           <w:sz w:val="22"/>
           <w:szCs w:val="22"/>
         </w:rPr>
-        <w:t>{</w:t>
+        <w:t>{tgl_dikeluarkan}</w:t>
       </w:r>
-      <w:proofErr w:type="spellStart"/>
-      <w:r>
-        <w:rPr>
-          <w:sz w:val="22"/>
-          <w:szCs w:val="22"/>
-        </w:rPr>
-        <w:t>tgl_dikeluarkan</w:t>
-      </w:r>
-      <w:proofErr w:type="spellEnd"/>
-      <w:r>
-        <w:rPr>
-          <w:sz w:val="22"/>
-          <w:szCs w:val="22"/>
-        </w:rPr>
-        <w:t>}</w:t>
-      </w:r>
+      <w:bookmarkEnd w:id="0"/>
     </w:p>
     <w:p>
       <w:pPr>
@@ -2692,53 +2041,12 @@
         </w:rPr>
         <w:tab/>
       </w:r>
-      <w:proofErr w:type="spellStart"/>
       <w:r>
         <w:rPr>
           <w:sz w:val="22"/>
           <w:szCs w:val="22"/>
         </w:rPr>
-        <w:t>Pejabat</w:t>
-      </w:r>
-      <w:proofErr w:type="spellEnd"/>
-      <w:r>
-        <w:rPr>
-          <w:sz w:val="22"/>
-          <w:szCs w:val="22"/>
-        </w:rPr>
-        <w:t xml:space="preserve"> </w:t>
-      </w:r>
-      <w:proofErr w:type="spellStart"/>
-      <w:r>
-        <w:rPr>
-          <w:sz w:val="22"/>
-          <w:szCs w:val="22"/>
-        </w:rPr>
-        <w:t>Pembuat</w:t>
-      </w:r>
-      <w:proofErr w:type="spellEnd"/>
-      <w:r>
-        <w:rPr>
-          <w:sz w:val="22"/>
-          <w:szCs w:val="22"/>
-        </w:rPr>
-        <w:t xml:space="preserve"> </w:t>
-      </w:r>
-      <w:proofErr w:type="spellStart"/>
-      <w:r>
-        <w:rPr>
-          <w:sz w:val="22"/>
-          <w:szCs w:val="22"/>
-        </w:rPr>
-        <w:t>Komitmen</w:t>
-      </w:r>
-      <w:proofErr w:type="spellEnd"/>
-      <w:r>
-        <w:rPr>
-          <w:sz w:val="22"/>
-          <w:szCs w:val="22"/>
-        </w:rPr>
-        <w:t xml:space="preserve">, </w:t>
+        <w:t xml:space="preserve">Pejabat Pembuat Komitmen, </w:t>
       </w:r>
     </w:p>
     <w:p>
@@ -2790,23 +2098,8 @@
           <w:sz w:val="22"/>
           <w:szCs w:val="22"/>
         </w:rPr>
-        <w:t>{</w:t>
-      </w:r>
-      <w:proofErr w:type="spellStart"/>
-      <w:r>
-        <w:rPr>
-          <w:sz w:val="22"/>
-          <w:szCs w:val="22"/>
-        </w:rPr>
-        <w:t>ppk_name</w:t>
-      </w:r>
-      <w:proofErr w:type="spellEnd"/>
-      <w:r>
-        <w:rPr>
-          <w:sz w:val="22"/>
-          <w:szCs w:val="22"/>
-        </w:rPr>
-        <w:t>}</w:t>
+        <w:tab/>
+        <w:t>#</w:t>
       </w:r>
     </w:p>
     <w:p>
@@ -2822,6 +2115,22 @@
           <w:sz w:val="22"/>
           <w:szCs w:val="22"/>
         </w:rPr>
+        <w:t>{ppk_name}</w:t>
+      </w:r>
+    </w:p>
+    <w:p>
+      <w:pPr>
+        <w:ind w:left="5760" w:firstLine="720"/>
+        <w:rPr>
+          <w:sz w:val="22"/>
+          <w:szCs w:val="22"/>
+        </w:rPr>
+      </w:pPr>
+      <w:r>
+        <w:rPr>
+          <w:sz w:val="22"/>
+          <w:szCs w:val="22"/>
+        </w:rPr>
         <w:t xml:space="preserve">NIP.  </w:t>
       </w:r>
       <w:r>
@@ -2829,23 +2138,7 @@
           <w:sz w:val="22"/>
           <w:szCs w:val="22"/>
         </w:rPr>
-        <w:t>{</w:t>
-      </w:r>
-      <w:proofErr w:type="spellStart"/>
-      <w:r>
-        <w:rPr>
-          <w:sz w:val="22"/>
-          <w:szCs w:val="22"/>
-        </w:rPr>
-        <w:t>ppk_nip</w:t>
-      </w:r>
-      <w:proofErr w:type="spellEnd"/>
-      <w:r>
-        <w:rPr>
-          <w:sz w:val="22"/>
-          <w:szCs w:val="22"/>
-        </w:rPr>
-        <w:t>}</w:t>
+        <w:t>{ppk_nip}</w:t>
       </w:r>
     </w:p>
     <w:p>
@@ -2931,33 +2224,8 @@
                 <w:sz w:val="22"/>
                 <w:szCs w:val="22"/>
               </w:rPr>
-              <w:t xml:space="preserve">I.  </w:t>
-            </w:r>
-            <w:proofErr w:type="spellStart"/>
-            <w:r>
-              <w:rPr>
-                <w:sz w:val="22"/>
-                <w:szCs w:val="22"/>
-              </w:rPr>
-              <w:t>Berangkat</w:t>
-            </w:r>
-            <w:proofErr w:type="spellEnd"/>
-            <w:r>
-              <w:rPr>
-                <w:sz w:val="22"/>
-                <w:szCs w:val="22"/>
-              </w:rPr>
-              <w:t xml:space="preserve"> </w:t>
-            </w:r>
-            <w:proofErr w:type="spellStart"/>
-            <w:r>
-              <w:rPr>
-                <w:sz w:val="22"/>
-                <w:szCs w:val="22"/>
-              </w:rPr>
-              <w:t>dari</w:t>
-            </w:r>
-            <w:proofErr w:type="spellEnd"/>
+              <w:t>I.  Berangkat dari</w:t>
+            </w:r>
           </w:p>
           <w:p>
             <w:pPr>
@@ -2976,39 +2244,7 @@
                 <w:sz w:val="22"/>
                 <w:szCs w:val="22"/>
               </w:rPr>
-              <w:t>(</w:t>
-            </w:r>
-            <w:proofErr w:type="spellStart"/>
-            <w:r>
-              <w:rPr>
-                <w:sz w:val="22"/>
-                <w:szCs w:val="22"/>
-              </w:rPr>
-              <w:t>Tempat</w:t>
-            </w:r>
-            <w:proofErr w:type="spellEnd"/>
-            <w:r>
-              <w:rPr>
-                <w:sz w:val="22"/>
-                <w:szCs w:val="22"/>
-              </w:rPr>
-              <w:t xml:space="preserve"> </w:t>
-            </w:r>
-            <w:proofErr w:type="spellStart"/>
-            <w:r>
-              <w:rPr>
-                <w:sz w:val="22"/>
-                <w:szCs w:val="22"/>
-              </w:rPr>
-              <w:t>kedudukan</w:t>
-            </w:r>
-            <w:proofErr w:type="spellEnd"/>
-            <w:r>
-              <w:rPr>
-                <w:sz w:val="22"/>
-                <w:szCs w:val="22"/>
-              </w:rPr>
-              <w:t xml:space="preserve">) </w:t>
+              <w:t xml:space="preserve">(Tempat kedudukan) </w:t>
             </w:r>
           </w:p>
           <w:p>
@@ -3049,17 +2285,8 @@
                 <w:sz w:val="22"/>
                 <w:szCs w:val="22"/>
               </w:rPr>
-              <w:t xml:space="preserve">Pada </w:t>
-            </w:r>
-            <w:proofErr w:type="spellStart"/>
-            <w:r>
-              <w:rPr>
-                <w:sz w:val="22"/>
-                <w:szCs w:val="22"/>
-              </w:rPr>
-              <w:t>Tanggal</w:t>
-            </w:r>
-            <w:proofErr w:type="spellEnd"/>
+              <w:t>Pada Tanggal</w:t>
+            </w:r>
           </w:p>
         </w:tc>
         <w:tc>
@@ -3086,7 +2313,14 @@
                 <w:sz w:val="22"/>
                 <w:szCs w:val="22"/>
               </w:rPr>
-              <w:t>: Padang</w:t>
+              <w:t xml:space="preserve">: </w:t>
+            </w:r>
+            <w:r>
+              <w:rPr>
+                <w:sz w:val="22"/>
+                <w:szCs w:val="22"/>
+              </w:rPr>
+              <w:t>{tempat_berangkat}</w:t>
             </w:r>
           </w:p>
           <w:p>
@@ -3134,16 +2368,12 @@
                 <w:sz w:val="22"/>
                 <w:szCs w:val="22"/>
               </w:rPr>
-              <w:t>………..</w:t>
-            </w:r>
-          </w:p>
-          <w:p>
-            <w:pPr>
-              <w:tabs>
-                <w:tab w:val="center" w:pos="5007"/>
-                <w:tab w:val="left" w:pos="7320"/>
-              </w:tabs>
-              <w:ind w:left="72" w:right="-108" w:hanging="72"/>
+              <w:t>{tempat_tujuan}</w:t>
+            </w:r>
+          </w:p>
+          <w:p>
+            <w:pPr>
+              <w:spacing w:line="360" w:lineRule="auto"/>
               <w:rPr>
                 <w:sz w:val="22"/>
                 <w:szCs w:val="22"/>
@@ -3161,9 +2391,8 @@
               <w:rPr>
                 <w:sz w:val="22"/>
                 <w:szCs w:val="22"/>
-                <w:lang w:val="sv-SE"/>
-              </w:rPr>
-              <w:t>..............</w:t>
+              </w:rPr>
+              <w:t>{tgl_berangkat}</w:t>
             </w:r>
           </w:p>
         </w:tc>
@@ -3253,6 +2482,13 @@
                 <w:szCs w:val="22"/>
               </w:rPr>
             </w:pPr>
+            <w:r>
+              <w:rPr>
+                <w:sz w:val="22"/>
+                <w:szCs w:val="22"/>
+              </w:rPr>
+              <w:t>^</w:t>
+            </w:r>
           </w:p>
           <w:p>
             <w:pPr>
@@ -3267,7 +2503,7 @@
                 <w:sz w:val="22"/>
                 <w:szCs w:val="22"/>
               </w:rPr>
-              <w:t>…………………………</w:t>
+              <w:t>{nama_dekan}</w:t>
             </w:r>
           </w:p>
           <w:p>
@@ -3332,17 +2568,8 @@
                 <w:sz w:val="22"/>
                 <w:szCs w:val="22"/>
               </w:rPr>
-              <w:t xml:space="preserve"> II. Tiba di           </w:t>
-            </w:r>
-            <w:proofErr w:type="gramStart"/>
-            <w:r>
-              <w:rPr>
-                <w:sz w:val="22"/>
-                <w:szCs w:val="22"/>
-              </w:rPr>
-              <w:t xml:space="preserve">  :</w:t>
-            </w:r>
-            <w:proofErr w:type="gramEnd"/>
+              <w:t xml:space="preserve"> II. Tiba di             :</w:t>
+            </w:r>
             <w:r>
               <w:rPr>
                 <w:sz w:val="22"/>
@@ -3364,39 +2591,7 @@
                 <w:sz w:val="22"/>
                 <w:szCs w:val="22"/>
               </w:rPr>
-              <w:t xml:space="preserve">Pada </w:t>
-            </w:r>
-            <w:proofErr w:type="spellStart"/>
-            <w:r>
-              <w:rPr>
-                <w:sz w:val="22"/>
-                <w:szCs w:val="22"/>
-              </w:rPr>
-              <w:t>tanggal</w:t>
-            </w:r>
-            <w:proofErr w:type="spellEnd"/>
-            <w:r>
-              <w:rPr>
-                <w:sz w:val="22"/>
-                <w:szCs w:val="22"/>
-              </w:rPr>
-              <w:t xml:space="preserve"> </w:t>
-            </w:r>
-            <w:proofErr w:type="gramStart"/>
-            <w:r>
-              <w:rPr>
-                <w:sz w:val="22"/>
-                <w:szCs w:val="22"/>
-              </w:rPr>
-              <w:t xml:space="preserve">  :</w:t>
-            </w:r>
-            <w:proofErr w:type="gramEnd"/>
-            <w:r>
-              <w:rPr>
-                <w:sz w:val="22"/>
-                <w:szCs w:val="22"/>
-              </w:rPr>
-              <w:t xml:space="preserve"> </w:t>
+              <w:t xml:space="preserve">Pada tanggal   : </w:t>
             </w:r>
           </w:p>
           <w:p>
@@ -3431,39 +2626,7 @@
                 <w:sz w:val="22"/>
                 <w:szCs w:val="22"/>
               </w:rPr>
-              <w:t xml:space="preserve">    </w:t>
-            </w:r>
-            <w:proofErr w:type="spellStart"/>
-            <w:r>
-              <w:rPr>
-                <w:sz w:val="22"/>
-                <w:szCs w:val="22"/>
-              </w:rPr>
-              <w:t>Berangkat</w:t>
-            </w:r>
-            <w:proofErr w:type="spellEnd"/>
-            <w:r>
-              <w:rPr>
-                <w:sz w:val="22"/>
-                <w:szCs w:val="22"/>
-              </w:rPr>
-              <w:t xml:space="preserve"> </w:t>
-            </w:r>
-            <w:proofErr w:type="gramStart"/>
-            <w:r>
-              <w:rPr>
-                <w:sz w:val="22"/>
-                <w:szCs w:val="22"/>
-              </w:rPr>
-              <w:t>dari  :</w:t>
-            </w:r>
-            <w:proofErr w:type="gramEnd"/>
-            <w:r>
-              <w:rPr>
-                <w:sz w:val="22"/>
-                <w:szCs w:val="22"/>
-              </w:rPr>
-              <w:t xml:space="preserve"> </w:t>
+              <w:t xml:space="preserve">    Berangkat dari  : </w:t>
             </w:r>
           </w:p>
           <w:p>
@@ -3493,54 +2656,22 @@
                 <w:szCs w:val="22"/>
               </w:rPr>
               <w:tab/>
-              <w:t xml:space="preserve"> </w:t>
-            </w:r>
-            <w:proofErr w:type="gramStart"/>
-            <w:r>
-              <w:rPr>
-                <w:sz w:val="22"/>
-                <w:szCs w:val="22"/>
-              </w:rPr>
-              <w:t xml:space="preserve">  :</w:t>
-            </w:r>
-            <w:proofErr w:type="gramEnd"/>
-            <w:r>
-              <w:rPr>
-                <w:sz w:val="22"/>
-                <w:szCs w:val="22"/>
-              </w:rPr>
-              <w:t xml:space="preserve"> </w:t>
-            </w:r>
-          </w:p>
-          <w:p>
-            <w:pPr>
-              <w:rPr>
-                <w:sz w:val="22"/>
-                <w:szCs w:val="22"/>
-              </w:rPr>
-            </w:pPr>
-            <w:r>
-              <w:rPr>
-                <w:sz w:val="22"/>
-                <w:szCs w:val="22"/>
-              </w:rPr>
-              <w:t xml:space="preserve">    Pada </w:t>
-            </w:r>
-            <w:proofErr w:type="spellStart"/>
-            <w:r>
-              <w:rPr>
-                <w:sz w:val="22"/>
-                <w:szCs w:val="22"/>
-              </w:rPr>
-              <w:t>tanggal</w:t>
-            </w:r>
-            <w:proofErr w:type="spellEnd"/>
-            <w:r>
-              <w:rPr>
-                <w:sz w:val="22"/>
-                <w:szCs w:val="22"/>
-              </w:rPr>
-              <w:t xml:space="preserve"> </w:t>
+              <w:t xml:space="preserve">   : </w:t>
+            </w:r>
+          </w:p>
+          <w:p>
+            <w:pPr>
+              <w:rPr>
+                <w:sz w:val="22"/>
+                <w:szCs w:val="22"/>
+              </w:rPr>
+            </w:pPr>
+            <w:r>
+              <w:rPr>
+                <w:sz w:val="22"/>
+                <w:szCs w:val="22"/>
+              </w:rPr>
+              <w:t xml:space="preserve">    Pada tanggal </w:t>
             </w:r>
             <w:r>
               <w:rPr>
@@ -3548,23 +2679,7 @@
                 <w:szCs w:val="22"/>
               </w:rPr>
               <w:tab/>
-              <w:t xml:space="preserve"> </w:t>
-            </w:r>
-            <w:proofErr w:type="gramStart"/>
-            <w:r>
-              <w:rPr>
-                <w:sz w:val="22"/>
-                <w:szCs w:val="22"/>
-              </w:rPr>
-              <w:t xml:space="preserve">  :</w:t>
-            </w:r>
-            <w:proofErr w:type="gramEnd"/>
-            <w:r>
-              <w:rPr>
-                <w:sz w:val="22"/>
-                <w:szCs w:val="22"/>
-              </w:rPr>
-              <w:t xml:space="preserve"> </w:t>
+              <w:t xml:space="preserve">   : </w:t>
             </w:r>
             <w:r>
               <w:rPr>
@@ -3686,17 +2801,8 @@
                 <w:szCs w:val="22"/>
               </w:rPr>
               <w:tab/>
-              <w:t xml:space="preserve">   </w:t>
-            </w:r>
-            <w:proofErr w:type="gramStart"/>
-            <w:r>
-              <w:rPr>
-                <w:sz w:val="22"/>
-                <w:szCs w:val="22"/>
-              </w:rPr>
-              <w:t xml:space="preserve">  :</w:t>
-            </w:r>
-            <w:proofErr w:type="gramEnd"/>
+              <w:t xml:space="preserve">     :</w:t>
+            </w:r>
             <w:r>
               <w:rPr>
                 <w:sz w:val="22"/>
@@ -3718,39 +2824,7 @@
                 <w:sz w:val="22"/>
                 <w:szCs w:val="22"/>
               </w:rPr>
-              <w:t xml:space="preserve">Pada </w:t>
-            </w:r>
-            <w:proofErr w:type="spellStart"/>
-            <w:r>
-              <w:rPr>
-                <w:sz w:val="22"/>
-                <w:szCs w:val="22"/>
-              </w:rPr>
-              <w:t>tanggal</w:t>
-            </w:r>
-            <w:proofErr w:type="spellEnd"/>
-            <w:r>
-              <w:rPr>
-                <w:sz w:val="22"/>
-                <w:szCs w:val="22"/>
-              </w:rPr>
-              <w:t xml:space="preserve">  </w:t>
-            </w:r>
-            <w:proofErr w:type="gramStart"/>
-            <w:r>
-              <w:rPr>
-                <w:sz w:val="22"/>
-                <w:szCs w:val="22"/>
-              </w:rPr>
-              <w:t xml:space="preserve">  :</w:t>
-            </w:r>
-            <w:proofErr w:type="gramEnd"/>
-            <w:r>
-              <w:rPr>
-                <w:sz w:val="22"/>
-                <w:szCs w:val="22"/>
-              </w:rPr>
-              <w:t xml:space="preserve"> </w:t>
+              <w:t xml:space="preserve">Pada tanggal    : </w:t>
             </w:r>
           </w:p>
           <w:p>
@@ -3839,33 +2913,8 @@
                 <w:sz w:val="22"/>
                 <w:szCs w:val="22"/>
               </w:rPr>
-              <w:t xml:space="preserve">    </w:t>
-            </w:r>
-            <w:proofErr w:type="spellStart"/>
-            <w:r>
-              <w:rPr>
-                <w:sz w:val="22"/>
-                <w:szCs w:val="22"/>
-              </w:rPr>
-              <w:t>Berangkat</w:t>
-            </w:r>
-            <w:proofErr w:type="spellEnd"/>
-            <w:r>
-              <w:rPr>
-                <w:sz w:val="22"/>
-                <w:szCs w:val="22"/>
-              </w:rPr>
-              <w:t xml:space="preserve"> </w:t>
-            </w:r>
-            <w:proofErr w:type="gramStart"/>
-            <w:r>
-              <w:rPr>
-                <w:sz w:val="22"/>
-                <w:szCs w:val="22"/>
-              </w:rPr>
-              <w:t>dari  :</w:t>
-            </w:r>
-            <w:proofErr w:type="gramEnd"/>
+              <w:t xml:space="preserve">    Berangkat dari  :</w:t>
+            </w:r>
           </w:p>
           <w:p>
             <w:pPr>
@@ -3894,65 +2943,31 @@
                 <w:szCs w:val="22"/>
               </w:rPr>
               <w:tab/>
-              <w:t xml:space="preserve"> </w:t>
-            </w:r>
-            <w:proofErr w:type="gramStart"/>
-            <w:r>
-              <w:rPr>
-                <w:sz w:val="22"/>
-                <w:szCs w:val="22"/>
-              </w:rPr>
-              <w:t xml:space="preserve">  :</w:t>
-            </w:r>
-            <w:proofErr w:type="gramEnd"/>
-            <w:r>
-              <w:rPr>
-                <w:sz w:val="22"/>
-                <w:szCs w:val="22"/>
-              </w:rPr>
-              <w:t xml:space="preserve"> </w:t>
-            </w:r>
-          </w:p>
-          <w:p>
-            <w:pPr>
-              <w:rPr>
-                <w:sz w:val="22"/>
-                <w:szCs w:val="22"/>
-              </w:rPr>
-            </w:pPr>
-            <w:r>
-              <w:rPr>
-                <w:sz w:val="22"/>
-                <w:szCs w:val="22"/>
-              </w:rPr>
-              <w:t xml:space="preserve">    Pada </w:t>
-            </w:r>
-            <w:proofErr w:type="spellStart"/>
-            <w:r>
-              <w:rPr>
-                <w:sz w:val="22"/>
-                <w:szCs w:val="22"/>
-              </w:rPr>
-              <w:t>tanggal</w:t>
-            </w:r>
-            <w:proofErr w:type="spellEnd"/>
+              <w:t xml:space="preserve">   : </w:t>
+            </w:r>
+          </w:p>
+          <w:p>
+            <w:pPr>
+              <w:rPr>
+                <w:sz w:val="22"/>
+                <w:szCs w:val="22"/>
+              </w:rPr>
+            </w:pPr>
+            <w:r>
+              <w:rPr>
+                <w:sz w:val="22"/>
+                <w:szCs w:val="22"/>
+              </w:rPr>
+              <w:t xml:space="preserve">    Pada tanggal</w:t>
+            </w:r>
             <w:r>
               <w:rPr>
                 <w:sz w:val="22"/>
                 <w:szCs w:val="22"/>
               </w:rPr>
               <w:tab/>
-              <w:t xml:space="preserve"> </w:t>
-            </w:r>
-            <w:proofErr w:type="gramStart"/>
-            <w:r>
-              <w:rPr>
-                <w:sz w:val="22"/>
-                <w:szCs w:val="22"/>
-              </w:rPr>
-              <w:t xml:space="preserve">  :</w:t>
-            </w:r>
-            <w:proofErr w:type="gramEnd"/>
+              <w:t xml:space="preserve">   :</w:t>
+            </w:r>
           </w:p>
           <w:p>
             <w:pPr>
@@ -4047,17 +3062,8 @@
                 <w:szCs w:val="22"/>
               </w:rPr>
               <w:tab/>
-              <w:t xml:space="preserve">   </w:t>
-            </w:r>
-            <w:proofErr w:type="gramStart"/>
-            <w:r>
-              <w:rPr>
-                <w:sz w:val="22"/>
-                <w:szCs w:val="22"/>
-              </w:rPr>
-              <w:t xml:space="preserve">  :</w:t>
-            </w:r>
-            <w:proofErr w:type="gramEnd"/>
+              <w:t xml:space="preserve">     :</w:t>
+            </w:r>
             <w:r>
               <w:rPr>
                 <w:sz w:val="22"/>
@@ -4079,39 +3085,7 @@
                 <w:sz w:val="22"/>
                 <w:szCs w:val="22"/>
               </w:rPr>
-              <w:t xml:space="preserve">Pada </w:t>
-            </w:r>
-            <w:proofErr w:type="spellStart"/>
-            <w:r>
-              <w:rPr>
-                <w:sz w:val="22"/>
-                <w:szCs w:val="22"/>
-              </w:rPr>
-              <w:t>tanggal</w:t>
-            </w:r>
-            <w:proofErr w:type="spellEnd"/>
-            <w:r>
-              <w:rPr>
-                <w:sz w:val="22"/>
-                <w:szCs w:val="22"/>
-              </w:rPr>
-              <w:t xml:space="preserve">  </w:t>
-            </w:r>
-            <w:proofErr w:type="gramStart"/>
-            <w:r>
-              <w:rPr>
-                <w:sz w:val="22"/>
-                <w:szCs w:val="22"/>
-              </w:rPr>
-              <w:t xml:space="preserve">  :</w:t>
-            </w:r>
-            <w:proofErr w:type="gramEnd"/>
-            <w:r>
-              <w:rPr>
-                <w:sz w:val="22"/>
-                <w:szCs w:val="22"/>
-              </w:rPr>
-              <w:t xml:space="preserve"> </w:t>
+              <w:t xml:space="preserve">Pada tanggal    : </w:t>
             </w:r>
           </w:p>
           <w:p>
@@ -4204,33 +3178,8 @@
                 <w:sz w:val="22"/>
                 <w:szCs w:val="22"/>
               </w:rPr>
-              <w:t xml:space="preserve">    </w:t>
-            </w:r>
-            <w:proofErr w:type="spellStart"/>
-            <w:r>
-              <w:rPr>
-                <w:sz w:val="22"/>
-                <w:szCs w:val="22"/>
-              </w:rPr>
-              <w:t>Berangkat</w:t>
-            </w:r>
-            <w:proofErr w:type="spellEnd"/>
-            <w:r>
-              <w:rPr>
-                <w:sz w:val="22"/>
-                <w:szCs w:val="22"/>
-              </w:rPr>
-              <w:t xml:space="preserve"> </w:t>
-            </w:r>
-            <w:proofErr w:type="gramStart"/>
-            <w:r>
-              <w:rPr>
-                <w:sz w:val="22"/>
-                <w:szCs w:val="22"/>
-              </w:rPr>
-              <w:t>dari  :</w:t>
-            </w:r>
-            <w:proofErr w:type="gramEnd"/>
+              <w:t xml:space="preserve">    Berangkat dari  :</w:t>
+            </w:r>
           </w:p>
           <w:p>
             <w:pPr>
@@ -4259,65 +3208,31 @@
                 <w:szCs w:val="22"/>
               </w:rPr>
               <w:tab/>
-              <w:t xml:space="preserve">  </w:t>
-            </w:r>
-            <w:proofErr w:type="gramStart"/>
-            <w:r>
-              <w:rPr>
-                <w:sz w:val="22"/>
-                <w:szCs w:val="22"/>
-              </w:rPr>
-              <w:t xml:space="preserve">  :</w:t>
-            </w:r>
-            <w:proofErr w:type="gramEnd"/>
-            <w:r>
-              <w:rPr>
-                <w:sz w:val="22"/>
-                <w:szCs w:val="22"/>
-              </w:rPr>
-              <w:t xml:space="preserve"> </w:t>
-            </w:r>
-          </w:p>
-          <w:p>
-            <w:pPr>
-              <w:rPr>
-                <w:sz w:val="22"/>
-                <w:szCs w:val="22"/>
-              </w:rPr>
-            </w:pPr>
-            <w:r>
-              <w:rPr>
-                <w:sz w:val="22"/>
-                <w:szCs w:val="22"/>
-              </w:rPr>
-              <w:t xml:space="preserve">    Pada </w:t>
-            </w:r>
-            <w:proofErr w:type="spellStart"/>
-            <w:r>
-              <w:rPr>
-                <w:sz w:val="22"/>
-                <w:szCs w:val="22"/>
-              </w:rPr>
-              <w:t>tanggal</w:t>
-            </w:r>
-            <w:proofErr w:type="spellEnd"/>
+              <w:t xml:space="preserve">    : </w:t>
+            </w:r>
+          </w:p>
+          <w:p>
+            <w:pPr>
+              <w:rPr>
+                <w:sz w:val="22"/>
+                <w:szCs w:val="22"/>
+              </w:rPr>
+            </w:pPr>
+            <w:r>
+              <w:rPr>
+                <w:sz w:val="22"/>
+                <w:szCs w:val="22"/>
+              </w:rPr>
+              <w:t xml:space="preserve">    Pada tanggal</w:t>
+            </w:r>
             <w:r>
               <w:rPr>
                 <w:sz w:val="22"/>
                 <w:szCs w:val="22"/>
               </w:rPr>
               <w:tab/>
-              <w:t xml:space="preserve">  </w:t>
-            </w:r>
-            <w:proofErr w:type="gramStart"/>
-            <w:r>
-              <w:rPr>
-                <w:sz w:val="22"/>
-                <w:szCs w:val="22"/>
-              </w:rPr>
-              <w:t xml:space="preserve">  :</w:t>
-            </w:r>
-            <w:proofErr w:type="gramEnd"/>
+              <w:t xml:space="preserve">    :</w:t>
+            </w:r>
           </w:p>
           <w:p>
             <w:pPr>
@@ -4414,17 +3329,8 @@
                 <w:szCs w:val="22"/>
               </w:rPr>
               <w:tab/>
-              <w:t xml:space="preserve">   </w:t>
-            </w:r>
-            <w:proofErr w:type="gramStart"/>
-            <w:r>
-              <w:rPr>
-                <w:sz w:val="22"/>
-                <w:szCs w:val="22"/>
-              </w:rPr>
-              <w:t xml:space="preserve">  :</w:t>
-            </w:r>
-            <w:proofErr w:type="gramEnd"/>
+              <w:t xml:space="preserve">     :</w:t>
+            </w:r>
             <w:r>
               <w:rPr>
                 <w:sz w:val="22"/>
@@ -4446,39 +3352,7 @@
                 <w:sz w:val="22"/>
                 <w:szCs w:val="22"/>
               </w:rPr>
-              <w:t xml:space="preserve">Pada </w:t>
-            </w:r>
-            <w:proofErr w:type="spellStart"/>
-            <w:r>
-              <w:rPr>
-                <w:sz w:val="22"/>
-                <w:szCs w:val="22"/>
-              </w:rPr>
-              <w:t>tanggal</w:t>
-            </w:r>
-            <w:proofErr w:type="spellEnd"/>
-            <w:r>
-              <w:rPr>
-                <w:sz w:val="22"/>
-                <w:szCs w:val="22"/>
-              </w:rPr>
-              <w:t xml:space="preserve">  </w:t>
-            </w:r>
-            <w:proofErr w:type="gramStart"/>
-            <w:r>
-              <w:rPr>
-                <w:sz w:val="22"/>
-                <w:szCs w:val="22"/>
-              </w:rPr>
-              <w:t xml:space="preserve">  :</w:t>
-            </w:r>
-            <w:proofErr w:type="gramEnd"/>
-            <w:r>
-              <w:rPr>
-                <w:sz w:val="22"/>
-                <w:szCs w:val="22"/>
-              </w:rPr>
-              <w:t xml:space="preserve"> </w:t>
+              <w:t xml:space="preserve">Pada tanggal    : </w:t>
             </w:r>
           </w:p>
           <w:p>
@@ -4548,33 +3422,8 @@
                 <w:sz w:val="22"/>
                 <w:szCs w:val="22"/>
               </w:rPr>
-              <w:t xml:space="preserve">    </w:t>
-            </w:r>
-            <w:proofErr w:type="spellStart"/>
-            <w:r>
-              <w:rPr>
-                <w:sz w:val="22"/>
-                <w:szCs w:val="22"/>
-              </w:rPr>
-              <w:t>Berangkat</w:t>
-            </w:r>
-            <w:proofErr w:type="spellEnd"/>
-            <w:r>
-              <w:rPr>
-                <w:sz w:val="22"/>
-                <w:szCs w:val="22"/>
-              </w:rPr>
-              <w:t xml:space="preserve"> </w:t>
-            </w:r>
-            <w:proofErr w:type="gramStart"/>
-            <w:r>
-              <w:rPr>
-                <w:sz w:val="22"/>
-                <w:szCs w:val="22"/>
-              </w:rPr>
-              <w:t>dari  :</w:t>
-            </w:r>
-            <w:proofErr w:type="gramEnd"/>
+              <w:t xml:space="preserve">    Berangkat dari  :</w:t>
+            </w:r>
           </w:p>
           <w:p>
             <w:pPr>
@@ -4603,65 +3452,31 @@
                 <w:szCs w:val="22"/>
               </w:rPr>
               <w:tab/>
-              <w:t xml:space="preserve">  </w:t>
-            </w:r>
-            <w:proofErr w:type="gramStart"/>
-            <w:r>
-              <w:rPr>
-                <w:sz w:val="22"/>
-                <w:szCs w:val="22"/>
-              </w:rPr>
-              <w:t xml:space="preserve">  :</w:t>
-            </w:r>
-            <w:proofErr w:type="gramEnd"/>
-            <w:r>
-              <w:rPr>
-                <w:sz w:val="22"/>
-                <w:szCs w:val="22"/>
-              </w:rPr>
-              <w:t xml:space="preserve"> </w:t>
-            </w:r>
-          </w:p>
-          <w:p>
-            <w:pPr>
-              <w:rPr>
-                <w:sz w:val="22"/>
-                <w:szCs w:val="22"/>
-              </w:rPr>
-            </w:pPr>
-            <w:r>
-              <w:rPr>
-                <w:sz w:val="22"/>
-                <w:szCs w:val="22"/>
-              </w:rPr>
-              <w:t xml:space="preserve">    Pada </w:t>
-            </w:r>
-            <w:proofErr w:type="spellStart"/>
-            <w:r>
-              <w:rPr>
-                <w:sz w:val="22"/>
-                <w:szCs w:val="22"/>
-              </w:rPr>
-              <w:t>tanggal</w:t>
-            </w:r>
-            <w:proofErr w:type="spellEnd"/>
+              <w:t xml:space="preserve">    : </w:t>
+            </w:r>
+          </w:p>
+          <w:p>
+            <w:pPr>
+              <w:rPr>
+                <w:sz w:val="22"/>
+                <w:szCs w:val="22"/>
+              </w:rPr>
+            </w:pPr>
+            <w:r>
+              <w:rPr>
+                <w:sz w:val="22"/>
+                <w:szCs w:val="22"/>
+              </w:rPr>
+              <w:t xml:space="preserve">    Pada tanggal</w:t>
+            </w:r>
             <w:r>
               <w:rPr>
                 <w:sz w:val="22"/>
                 <w:szCs w:val="22"/>
               </w:rPr>
               <w:tab/>
-              <w:t xml:space="preserve">  </w:t>
-            </w:r>
-            <w:proofErr w:type="gramStart"/>
-            <w:r>
-              <w:rPr>
-                <w:sz w:val="22"/>
-                <w:szCs w:val="22"/>
-              </w:rPr>
-              <w:t xml:space="preserve">  :</w:t>
-            </w:r>
-            <w:proofErr w:type="gramEnd"/>
+              <w:t xml:space="preserve">    :</w:t>
+            </w:r>
           </w:p>
           <w:p>
             <w:pPr>
@@ -4754,23 +3569,7 @@
                 <w:sz w:val="22"/>
                 <w:szCs w:val="22"/>
               </w:rPr>
-              <w:t xml:space="preserve">VI. Tiba di                     </w:t>
-            </w:r>
-            <w:proofErr w:type="gramStart"/>
-            <w:r>
-              <w:rPr>
-                <w:sz w:val="22"/>
-                <w:szCs w:val="22"/>
-              </w:rPr>
-              <w:t xml:space="preserve">  :</w:t>
-            </w:r>
-            <w:proofErr w:type="gramEnd"/>
-            <w:r>
-              <w:rPr>
-                <w:sz w:val="22"/>
-                <w:szCs w:val="22"/>
-              </w:rPr>
-              <w:t xml:space="preserve"> </w:t>
+              <w:t xml:space="preserve">VI. Tiba di                       : </w:t>
             </w:r>
           </w:p>
           <w:p>
@@ -4786,39 +3585,7 @@
                 <w:sz w:val="22"/>
                 <w:szCs w:val="22"/>
               </w:rPr>
-              <w:t xml:space="preserve"> (</w:t>
-            </w:r>
-            <w:proofErr w:type="spellStart"/>
-            <w:r>
-              <w:rPr>
-                <w:sz w:val="22"/>
-                <w:szCs w:val="22"/>
-              </w:rPr>
-              <w:t>Tempat</w:t>
-            </w:r>
-            <w:proofErr w:type="spellEnd"/>
-            <w:r>
-              <w:rPr>
-                <w:sz w:val="22"/>
-                <w:szCs w:val="22"/>
-              </w:rPr>
-              <w:t xml:space="preserve"> </w:t>
-            </w:r>
-            <w:proofErr w:type="spellStart"/>
-            <w:r>
-              <w:rPr>
-                <w:sz w:val="22"/>
-                <w:szCs w:val="22"/>
-              </w:rPr>
-              <w:t>kedudukan</w:t>
-            </w:r>
-            <w:proofErr w:type="spellEnd"/>
-            <w:r>
-              <w:rPr>
-                <w:sz w:val="22"/>
-                <w:szCs w:val="22"/>
-              </w:rPr>
-              <w:t xml:space="preserve">) </w:t>
+              <w:t xml:space="preserve"> (Tempat kedudukan) </w:t>
             </w:r>
           </w:p>
           <w:p>
@@ -4835,33 +3602,8 @@
                 <w:sz w:val="22"/>
                 <w:szCs w:val="22"/>
               </w:rPr>
-              <w:t xml:space="preserve"> Pada </w:t>
-            </w:r>
-            <w:proofErr w:type="spellStart"/>
-            <w:r>
-              <w:rPr>
-                <w:sz w:val="22"/>
-                <w:szCs w:val="22"/>
-              </w:rPr>
-              <w:t>tanggal</w:t>
-            </w:r>
-            <w:proofErr w:type="spellEnd"/>
-            <w:r>
-              <w:rPr>
-                <w:sz w:val="22"/>
-                <w:szCs w:val="22"/>
-              </w:rPr>
-              <w:t xml:space="preserve">            </w:t>
-            </w:r>
-            <w:proofErr w:type="gramStart"/>
-            <w:r>
-              <w:rPr>
-                <w:sz w:val="22"/>
-                <w:szCs w:val="22"/>
-              </w:rPr>
-              <w:t xml:space="preserve">  :</w:t>
-            </w:r>
-            <w:proofErr w:type="gramEnd"/>
+              <w:t xml:space="preserve"> Pada tanggal              :</w:t>
+            </w:r>
           </w:p>
         </w:tc>
         <w:tc>
@@ -4890,241 +3632,8 @@
                 <w:sz w:val="22"/>
                 <w:szCs w:val="22"/>
               </w:rPr>
-              <w:t xml:space="preserve">Telah </w:t>
-            </w:r>
-            <w:proofErr w:type="spellStart"/>
-            <w:r>
-              <w:rPr>
-                <w:sz w:val="22"/>
-                <w:szCs w:val="22"/>
-              </w:rPr>
-              <w:t>diperiksa</w:t>
-            </w:r>
-            <w:proofErr w:type="spellEnd"/>
-            <w:r>
-              <w:rPr>
-                <w:sz w:val="22"/>
-                <w:szCs w:val="22"/>
-              </w:rPr>
-              <w:t xml:space="preserve"> </w:t>
-            </w:r>
-            <w:proofErr w:type="spellStart"/>
-            <w:r>
-              <w:rPr>
-                <w:sz w:val="22"/>
-                <w:szCs w:val="22"/>
-              </w:rPr>
-              <w:t>dengan</w:t>
-            </w:r>
-            <w:proofErr w:type="spellEnd"/>
-            <w:r>
-              <w:rPr>
-                <w:sz w:val="22"/>
-                <w:szCs w:val="22"/>
-              </w:rPr>
-              <w:t xml:space="preserve"> </w:t>
-            </w:r>
-            <w:proofErr w:type="spellStart"/>
-            <w:r>
-              <w:rPr>
-                <w:sz w:val="22"/>
-                <w:szCs w:val="22"/>
-              </w:rPr>
-              <w:t>keterangan</w:t>
-            </w:r>
-            <w:proofErr w:type="spellEnd"/>
-            <w:r>
-              <w:rPr>
-                <w:sz w:val="22"/>
-                <w:szCs w:val="22"/>
-              </w:rPr>
-              <w:t xml:space="preserve"> </w:t>
-            </w:r>
-            <w:proofErr w:type="spellStart"/>
-            <w:r>
-              <w:rPr>
-                <w:sz w:val="22"/>
-                <w:szCs w:val="22"/>
-              </w:rPr>
-              <w:t>bahwa</w:t>
-            </w:r>
-            <w:proofErr w:type="spellEnd"/>
-            <w:r>
-              <w:rPr>
-                <w:sz w:val="22"/>
-                <w:szCs w:val="22"/>
-              </w:rPr>
-              <w:t xml:space="preserve"> </w:t>
-            </w:r>
-            <w:proofErr w:type="spellStart"/>
-            <w:r>
-              <w:rPr>
-                <w:sz w:val="22"/>
-                <w:szCs w:val="22"/>
-              </w:rPr>
-              <w:t>perjalanan</w:t>
-            </w:r>
-            <w:proofErr w:type="spellEnd"/>
-            <w:r>
-              <w:rPr>
-                <w:sz w:val="22"/>
-                <w:szCs w:val="22"/>
-              </w:rPr>
-              <w:t xml:space="preserve"> </w:t>
-            </w:r>
-            <w:proofErr w:type="spellStart"/>
-            <w:r>
-              <w:rPr>
-                <w:sz w:val="22"/>
-                <w:szCs w:val="22"/>
-              </w:rPr>
-              <w:t>tersebut</w:t>
-            </w:r>
-            <w:proofErr w:type="spellEnd"/>
-            <w:r>
-              <w:rPr>
-                <w:sz w:val="22"/>
-                <w:szCs w:val="22"/>
-              </w:rPr>
-              <w:t xml:space="preserve"> di </w:t>
-            </w:r>
-            <w:proofErr w:type="spellStart"/>
-            <w:r>
-              <w:rPr>
-                <w:sz w:val="22"/>
-                <w:szCs w:val="22"/>
-              </w:rPr>
-              <w:t>atas</w:t>
-            </w:r>
-            <w:proofErr w:type="spellEnd"/>
-            <w:r>
-              <w:rPr>
-                <w:sz w:val="22"/>
-                <w:szCs w:val="22"/>
-              </w:rPr>
-              <w:t xml:space="preserve"> </w:t>
-            </w:r>
-            <w:proofErr w:type="spellStart"/>
-            <w:r>
-              <w:rPr>
-                <w:sz w:val="22"/>
-                <w:szCs w:val="22"/>
-              </w:rPr>
-              <w:t>benar</w:t>
-            </w:r>
-            <w:proofErr w:type="spellEnd"/>
-            <w:r>
-              <w:rPr>
-                <w:sz w:val="22"/>
-                <w:szCs w:val="22"/>
-              </w:rPr>
-              <w:t xml:space="preserve"> </w:t>
-            </w:r>
-            <w:proofErr w:type="spellStart"/>
-            <w:r>
-              <w:rPr>
-                <w:sz w:val="22"/>
-                <w:szCs w:val="22"/>
-              </w:rPr>
-              <w:t>dilakukan</w:t>
-            </w:r>
-            <w:proofErr w:type="spellEnd"/>
-            <w:r>
-              <w:rPr>
-                <w:sz w:val="22"/>
-                <w:szCs w:val="22"/>
-              </w:rPr>
-              <w:t xml:space="preserve"> </w:t>
-            </w:r>
-            <w:proofErr w:type="spellStart"/>
-            <w:r>
-              <w:rPr>
-                <w:sz w:val="22"/>
-                <w:szCs w:val="22"/>
-              </w:rPr>
-              <w:t>atas</w:t>
-            </w:r>
-            <w:proofErr w:type="spellEnd"/>
-            <w:r>
-              <w:rPr>
-                <w:sz w:val="22"/>
-                <w:szCs w:val="22"/>
-              </w:rPr>
-              <w:t xml:space="preserve"> </w:t>
-            </w:r>
-            <w:proofErr w:type="spellStart"/>
-            <w:r>
-              <w:rPr>
-                <w:sz w:val="22"/>
-                <w:szCs w:val="22"/>
-              </w:rPr>
-              <w:t>perintahnya</w:t>
-            </w:r>
-            <w:proofErr w:type="spellEnd"/>
-            <w:r>
-              <w:rPr>
-                <w:sz w:val="22"/>
-                <w:szCs w:val="22"/>
-              </w:rPr>
-              <w:t xml:space="preserve"> dan </w:t>
-            </w:r>
-            <w:proofErr w:type="spellStart"/>
-            <w:r>
-              <w:rPr>
-                <w:sz w:val="22"/>
-                <w:szCs w:val="22"/>
-              </w:rPr>
-              <w:t>semata-mata</w:t>
-            </w:r>
-            <w:proofErr w:type="spellEnd"/>
-            <w:r>
-              <w:rPr>
-                <w:sz w:val="22"/>
-                <w:szCs w:val="22"/>
-              </w:rPr>
-              <w:t xml:space="preserve"> </w:t>
-            </w:r>
-            <w:proofErr w:type="spellStart"/>
-            <w:r>
-              <w:rPr>
-                <w:sz w:val="22"/>
-                <w:szCs w:val="22"/>
-              </w:rPr>
-              <w:t>kepentingan</w:t>
-            </w:r>
-            <w:proofErr w:type="spellEnd"/>
-            <w:r>
-              <w:rPr>
-                <w:sz w:val="22"/>
-                <w:szCs w:val="22"/>
-              </w:rPr>
-              <w:t xml:space="preserve"> </w:t>
-            </w:r>
-            <w:proofErr w:type="spellStart"/>
-            <w:r>
-              <w:rPr>
-                <w:sz w:val="22"/>
-                <w:szCs w:val="22"/>
-              </w:rPr>
-              <w:t>jabatan</w:t>
-            </w:r>
-            <w:proofErr w:type="spellEnd"/>
-            <w:r>
-              <w:rPr>
-                <w:sz w:val="22"/>
-                <w:szCs w:val="22"/>
-              </w:rPr>
-              <w:t xml:space="preserve"> dalam waktu yang </w:t>
-            </w:r>
-            <w:proofErr w:type="spellStart"/>
-            <w:r>
-              <w:rPr>
-                <w:sz w:val="22"/>
-                <w:szCs w:val="22"/>
-              </w:rPr>
-              <w:t>sesingkat-singkatnya</w:t>
-            </w:r>
-            <w:proofErr w:type="spellEnd"/>
+              <w:t>Telah diperiksa dengan keterangan bahwa perjalanan tersebut di atas benar dilakukan atas perintahnya dan semata-mata kepentingan jabatan dalam waktu yang sesingkat-singkatnya</w:t>
+            </w:r>
           </w:p>
         </w:tc>
       </w:tr>
@@ -5174,55 +3683,7 @@
                 <w:sz w:val="22"/>
                 <w:szCs w:val="22"/>
               </w:rPr>
-              <w:t xml:space="preserve"> </w:t>
-            </w:r>
-            <w:proofErr w:type="spellStart"/>
-            <w:r>
-              <w:rPr>
-                <w:sz w:val="22"/>
-                <w:szCs w:val="22"/>
-              </w:rPr>
-              <w:t>Pejabat</w:t>
-            </w:r>
-            <w:proofErr w:type="spellEnd"/>
-            <w:r>
-              <w:rPr>
-                <w:sz w:val="22"/>
-                <w:szCs w:val="22"/>
-              </w:rPr>
-              <w:t xml:space="preserve"> </w:t>
-            </w:r>
-            <w:proofErr w:type="spellStart"/>
-            <w:r>
-              <w:rPr>
-                <w:sz w:val="22"/>
-                <w:szCs w:val="22"/>
-              </w:rPr>
-              <w:t>Pembuat</w:t>
-            </w:r>
-            <w:proofErr w:type="spellEnd"/>
-            <w:r>
-              <w:rPr>
-                <w:sz w:val="22"/>
-                <w:szCs w:val="22"/>
-              </w:rPr>
-              <w:t xml:space="preserve"> </w:t>
-            </w:r>
-            <w:proofErr w:type="spellStart"/>
-            <w:r>
-              <w:rPr>
-                <w:sz w:val="22"/>
-                <w:szCs w:val="22"/>
-              </w:rPr>
-              <w:t>Komitmen</w:t>
-            </w:r>
-            <w:proofErr w:type="spellEnd"/>
-            <w:r>
-              <w:rPr>
-                <w:sz w:val="22"/>
-                <w:szCs w:val="22"/>
-              </w:rPr>
-              <w:t>,</w:t>
+              <w:t xml:space="preserve"> Pejabat Pembuat Komitmen,</w:t>
             </w:r>
           </w:p>
           <w:p>
@@ -5344,53 +3805,12 @@
                 <w:szCs w:val="22"/>
               </w:rPr>
             </w:pPr>
-            <w:proofErr w:type="spellStart"/>
-            <w:r>
-              <w:rPr>
-                <w:sz w:val="22"/>
-                <w:szCs w:val="22"/>
-              </w:rPr>
-              <w:t>Pejabat</w:t>
-            </w:r>
-            <w:proofErr w:type="spellEnd"/>
-            <w:r>
-              <w:rPr>
-                <w:sz w:val="22"/>
-                <w:szCs w:val="22"/>
-              </w:rPr>
-              <w:t xml:space="preserve"> </w:t>
-            </w:r>
-            <w:proofErr w:type="spellStart"/>
-            <w:r>
-              <w:rPr>
-                <w:sz w:val="22"/>
-                <w:szCs w:val="22"/>
-              </w:rPr>
-              <w:t>Pembuat</w:t>
-            </w:r>
-            <w:proofErr w:type="spellEnd"/>
-            <w:r>
-              <w:rPr>
-                <w:sz w:val="22"/>
-                <w:szCs w:val="22"/>
-              </w:rPr>
-              <w:t xml:space="preserve"> </w:t>
-            </w:r>
-            <w:proofErr w:type="spellStart"/>
-            <w:r>
-              <w:rPr>
-                <w:sz w:val="22"/>
-                <w:szCs w:val="22"/>
-              </w:rPr>
-              <w:t>Komitmen</w:t>
-            </w:r>
-            <w:proofErr w:type="spellEnd"/>
-            <w:r>
-              <w:rPr>
-                <w:sz w:val="22"/>
-                <w:szCs w:val="22"/>
-              </w:rPr>
-              <w:t>,</w:t>
+            <w:r>
+              <w:rPr>
+                <w:sz w:val="22"/>
+                <w:szCs w:val="22"/>
+              </w:rPr>
+              <w:t>Pejabat Pembuat Komitmen,</w:t>
             </w:r>
           </w:p>
           <w:p>
@@ -5517,23 +3937,7 @@
                 <w:sz w:val="22"/>
                 <w:szCs w:val="22"/>
               </w:rPr>
-              <w:t xml:space="preserve">VII. </w:t>
-            </w:r>
-            <w:proofErr w:type="spellStart"/>
-            <w:r>
-              <w:rPr>
-                <w:sz w:val="22"/>
-                <w:szCs w:val="22"/>
-              </w:rPr>
-              <w:t>Catatan</w:t>
-            </w:r>
-            <w:proofErr w:type="spellEnd"/>
-            <w:r>
-              <w:rPr>
-                <w:sz w:val="22"/>
-                <w:szCs w:val="22"/>
-              </w:rPr>
-              <w:t xml:space="preserve"> Lain-lain</w:t>
+              <w:t>VII. Catatan Lain-lain</w:t>
             </w:r>
           </w:p>
         </w:tc>
@@ -5579,15 +3983,7 @@
                 <w:sz w:val="22"/>
                 <w:szCs w:val="22"/>
               </w:rPr>
-              <w:t>VIII</w:t>
-            </w:r>
-            <w:proofErr w:type="gramStart"/>
-            <w:r>
-              <w:rPr>
-                <w:sz w:val="22"/>
-                <w:szCs w:val="22"/>
-              </w:rPr>
-              <w:t xml:space="preserve">. </w:t>
+              <w:t xml:space="preserve">VIII. </w:t>
             </w:r>
             <w:r>
               <w:rPr>
@@ -5597,7 +3993,6 @@
               <w:tab/>
               <w:t>PERHATIAN</w:t>
             </w:r>
-            <w:proofErr w:type="gramEnd"/>
           </w:p>
           <w:p>
             <w:pPr>
@@ -5617,391 +4012,7 @@
                 <w:sz w:val="22"/>
                 <w:szCs w:val="22"/>
               </w:rPr>
-              <w:t xml:space="preserve">PPK yang </w:t>
-            </w:r>
-            <w:proofErr w:type="spellStart"/>
-            <w:r>
-              <w:rPr>
-                <w:sz w:val="22"/>
-                <w:szCs w:val="22"/>
-              </w:rPr>
-              <w:t>menerbitkan</w:t>
-            </w:r>
-            <w:proofErr w:type="spellEnd"/>
-            <w:r>
-              <w:rPr>
-                <w:sz w:val="22"/>
-                <w:szCs w:val="22"/>
-              </w:rPr>
-              <w:t xml:space="preserve"> SPD, </w:t>
-            </w:r>
-            <w:proofErr w:type="spellStart"/>
-            <w:r>
-              <w:rPr>
-                <w:sz w:val="22"/>
-                <w:szCs w:val="22"/>
-              </w:rPr>
-              <w:t>pegawai</w:t>
-            </w:r>
-            <w:proofErr w:type="spellEnd"/>
-            <w:r>
-              <w:rPr>
-                <w:sz w:val="22"/>
-                <w:szCs w:val="22"/>
-              </w:rPr>
-              <w:t xml:space="preserve"> yang </w:t>
-            </w:r>
-            <w:proofErr w:type="spellStart"/>
-            <w:r>
-              <w:rPr>
-                <w:sz w:val="22"/>
-                <w:szCs w:val="22"/>
-              </w:rPr>
-              <w:t>melakukan</w:t>
-            </w:r>
-            <w:proofErr w:type="spellEnd"/>
-            <w:r>
-              <w:rPr>
-                <w:sz w:val="22"/>
-                <w:szCs w:val="22"/>
-              </w:rPr>
-              <w:t xml:space="preserve"> </w:t>
-            </w:r>
-            <w:proofErr w:type="spellStart"/>
-            <w:r>
-              <w:rPr>
-                <w:sz w:val="22"/>
-                <w:szCs w:val="22"/>
-              </w:rPr>
-              <w:t>perjalanan</w:t>
-            </w:r>
-            <w:proofErr w:type="spellEnd"/>
-            <w:r>
-              <w:rPr>
-                <w:sz w:val="22"/>
-                <w:szCs w:val="22"/>
-              </w:rPr>
-              <w:t xml:space="preserve"> </w:t>
-            </w:r>
-            <w:proofErr w:type="spellStart"/>
-            <w:r>
-              <w:rPr>
-                <w:sz w:val="22"/>
-                <w:szCs w:val="22"/>
-              </w:rPr>
-              <w:t>dinas</w:t>
-            </w:r>
-            <w:proofErr w:type="spellEnd"/>
-            <w:r>
-              <w:rPr>
-                <w:sz w:val="22"/>
-                <w:szCs w:val="22"/>
-              </w:rPr>
-              <w:t xml:space="preserve">, para </w:t>
-            </w:r>
-            <w:proofErr w:type="spellStart"/>
-            <w:r>
-              <w:rPr>
-                <w:sz w:val="22"/>
-                <w:szCs w:val="22"/>
-              </w:rPr>
-              <w:t>pejabat</w:t>
-            </w:r>
-            <w:proofErr w:type="spellEnd"/>
-            <w:r>
-              <w:rPr>
-                <w:sz w:val="22"/>
-                <w:szCs w:val="22"/>
-              </w:rPr>
-              <w:t xml:space="preserve"> yang </w:t>
-            </w:r>
-            <w:proofErr w:type="spellStart"/>
-            <w:r>
-              <w:rPr>
-                <w:sz w:val="22"/>
-                <w:szCs w:val="22"/>
-              </w:rPr>
-              <w:t>mengesahkan</w:t>
-            </w:r>
-            <w:proofErr w:type="spellEnd"/>
-            <w:r>
-              <w:rPr>
-                <w:sz w:val="22"/>
-                <w:szCs w:val="22"/>
-              </w:rPr>
-              <w:t xml:space="preserve"> </w:t>
-            </w:r>
-            <w:proofErr w:type="spellStart"/>
-            <w:r>
-              <w:rPr>
-                <w:sz w:val="22"/>
-                <w:szCs w:val="22"/>
-              </w:rPr>
-              <w:t>tanggal</w:t>
-            </w:r>
-            <w:proofErr w:type="spellEnd"/>
-            <w:r>
-              <w:rPr>
-                <w:sz w:val="22"/>
-                <w:szCs w:val="22"/>
-              </w:rPr>
-              <w:t xml:space="preserve"> </w:t>
-            </w:r>
-            <w:proofErr w:type="spellStart"/>
-            <w:r>
-              <w:rPr>
-                <w:sz w:val="22"/>
-                <w:szCs w:val="22"/>
-              </w:rPr>
-              <w:t>berangkat</w:t>
-            </w:r>
-            <w:proofErr w:type="spellEnd"/>
-            <w:r>
-              <w:rPr>
-                <w:sz w:val="22"/>
-                <w:szCs w:val="22"/>
-              </w:rPr>
-              <w:t>/</w:t>
-            </w:r>
-            <w:proofErr w:type="spellStart"/>
-            <w:r>
-              <w:rPr>
-                <w:sz w:val="22"/>
-                <w:szCs w:val="22"/>
-              </w:rPr>
-              <w:t>tiba</w:t>
-            </w:r>
-            <w:proofErr w:type="spellEnd"/>
-            <w:r>
-              <w:rPr>
-                <w:sz w:val="22"/>
-                <w:szCs w:val="22"/>
-              </w:rPr>
-              <w:t xml:space="preserve">, </w:t>
-            </w:r>
-            <w:proofErr w:type="spellStart"/>
-            <w:r>
-              <w:rPr>
-                <w:sz w:val="22"/>
-                <w:szCs w:val="22"/>
-              </w:rPr>
-              <w:t>serta</w:t>
-            </w:r>
-            <w:proofErr w:type="spellEnd"/>
-            <w:r>
-              <w:rPr>
-                <w:sz w:val="22"/>
-                <w:szCs w:val="22"/>
-              </w:rPr>
-              <w:t xml:space="preserve"> </w:t>
-            </w:r>
-            <w:proofErr w:type="spellStart"/>
-            <w:r>
-              <w:rPr>
-                <w:sz w:val="22"/>
-                <w:szCs w:val="22"/>
-              </w:rPr>
-              <w:t>bendahara</w:t>
-            </w:r>
-            <w:proofErr w:type="spellEnd"/>
-            <w:r>
-              <w:rPr>
-                <w:sz w:val="22"/>
-                <w:szCs w:val="22"/>
-              </w:rPr>
-              <w:t xml:space="preserve"> </w:t>
-            </w:r>
-            <w:proofErr w:type="spellStart"/>
-            <w:r>
-              <w:rPr>
-                <w:sz w:val="22"/>
-                <w:szCs w:val="22"/>
-              </w:rPr>
-              <w:t>pengeluaran</w:t>
-            </w:r>
-            <w:proofErr w:type="spellEnd"/>
-            <w:r>
-              <w:rPr>
-                <w:sz w:val="22"/>
-                <w:szCs w:val="22"/>
-              </w:rPr>
-              <w:t xml:space="preserve"> </w:t>
-            </w:r>
-            <w:proofErr w:type="spellStart"/>
-            <w:r>
-              <w:rPr>
-                <w:sz w:val="22"/>
-                <w:szCs w:val="22"/>
-              </w:rPr>
-              <w:t>bertanggung</w:t>
-            </w:r>
-            <w:proofErr w:type="spellEnd"/>
-            <w:r>
-              <w:rPr>
-                <w:sz w:val="22"/>
-                <w:szCs w:val="22"/>
-              </w:rPr>
-              <w:t xml:space="preserve"> </w:t>
-            </w:r>
-            <w:proofErr w:type="spellStart"/>
-            <w:r>
-              <w:rPr>
-                <w:sz w:val="22"/>
-                <w:szCs w:val="22"/>
-              </w:rPr>
-              <w:t>jawab</w:t>
-            </w:r>
-            <w:proofErr w:type="spellEnd"/>
-            <w:r>
-              <w:rPr>
-                <w:sz w:val="22"/>
-                <w:szCs w:val="22"/>
-              </w:rPr>
-              <w:t xml:space="preserve"> berdasarkan </w:t>
-            </w:r>
-            <w:proofErr w:type="spellStart"/>
-            <w:r>
-              <w:rPr>
-                <w:sz w:val="22"/>
-                <w:szCs w:val="22"/>
-              </w:rPr>
-              <w:t>peraturan-peraturan</w:t>
-            </w:r>
-            <w:proofErr w:type="spellEnd"/>
-            <w:r>
-              <w:rPr>
-                <w:sz w:val="22"/>
-                <w:szCs w:val="22"/>
-              </w:rPr>
-              <w:t xml:space="preserve"> </w:t>
-            </w:r>
-            <w:proofErr w:type="spellStart"/>
-            <w:r>
-              <w:rPr>
-                <w:sz w:val="22"/>
-                <w:szCs w:val="22"/>
-              </w:rPr>
-              <w:t>Keuangan</w:t>
-            </w:r>
-            <w:proofErr w:type="spellEnd"/>
-            <w:r>
-              <w:rPr>
-                <w:sz w:val="22"/>
-                <w:szCs w:val="22"/>
-              </w:rPr>
-              <w:t xml:space="preserve"> Negara </w:t>
-            </w:r>
-            <w:proofErr w:type="spellStart"/>
-            <w:r>
-              <w:rPr>
-                <w:sz w:val="22"/>
-                <w:szCs w:val="22"/>
-              </w:rPr>
-              <w:t>apabila</w:t>
-            </w:r>
-            <w:proofErr w:type="spellEnd"/>
-            <w:r>
-              <w:rPr>
-                <w:sz w:val="22"/>
-                <w:szCs w:val="22"/>
-              </w:rPr>
-              <w:t xml:space="preserve"> negara </w:t>
-            </w:r>
-            <w:proofErr w:type="spellStart"/>
-            <w:r>
-              <w:rPr>
-                <w:sz w:val="22"/>
-                <w:szCs w:val="22"/>
-              </w:rPr>
-              <w:t>menderita</w:t>
-            </w:r>
-            <w:proofErr w:type="spellEnd"/>
-            <w:r>
-              <w:rPr>
-                <w:sz w:val="22"/>
-                <w:szCs w:val="22"/>
-              </w:rPr>
-              <w:t xml:space="preserve"> </w:t>
-            </w:r>
-            <w:proofErr w:type="spellStart"/>
-            <w:r>
-              <w:rPr>
-                <w:sz w:val="22"/>
-                <w:szCs w:val="22"/>
-              </w:rPr>
-              <w:t>rugi</w:t>
-            </w:r>
-            <w:proofErr w:type="spellEnd"/>
-            <w:r>
-              <w:rPr>
-                <w:sz w:val="22"/>
-                <w:szCs w:val="22"/>
-              </w:rPr>
-              <w:t xml:space="preserve"> </w:t>
-            </w:r>
-            <w:proofErr w:type="spellStart"/>
-            <w:r>
-              <w:rPr>
-                <w:sz w:val="22"/>
-                <w:szCs w:val="22"/>
-              </w:rPr>
-              <w:t>akibat</w:t>
-            </w:r>
-            <w:proofErr w:type="spellEnd"/>
-            <w:r>
-              <w:rPr>
-                <w:sz w:val="22"/>
-                <w:szCs w:val="22"/>
-              </w:rPr>
-              <w:t xml:space="preserve"> </w:t>
-            </w:r>
-            <w:proofErr w:type="spellStart"/>
-            <w:r>
-              <w:rPr>
-                <w:sz w:val="22"/>
-                <w:szCs w:val="22"/>
-              </w:rPr>
-              <w:t>kesalahan</w:t>
-            </w:r>
-            <w:proofErr w:type="spellEnd"/>
-            <w:r>
-              <w:rPr>
-                <w:sz w:val="22"/>
-                <w:szCs w:val="22"/>
-              </w:rPr>
-              <w:t xml:space="preserve">, </w:t>
-            </w:r>
-            <w:proofErr w:type="spellStart"/>
-            <w:r>
-              <w:rPr>
-                <w:sz w:val="22"/>
-                <w:szCs w:val="22"/>
-              </w:rPr>
-              <w:t>kelalaian</w:t>
-            </w:r>
-            <w:proofErr w:type="spellEnd"/>
-            <w:r>
-              <w:rPr>
-                <w:sz w:val="22"/>
-                <w:szCs w:val="22"/>
-              </w:rPr>
-              <w:t xml:space="preserve">, dan </w:t>
-            </w:r>
-            <w:proofErr w:type="spellStart"/>
-            <w:r>
-              <w:rPr>
-                <w:sz w:val="22"/>
-                <w:szCs w:val="22"/>
-              </w:rPr>
-              <w:t>kealpaannya</w:t>
-            </w:r>
-            <w:proofErr w:type="spellEnd"/>
-            <w:r>
-              <w:rPr>
-                <w:sz w:val="22"/>
-                <w:szCs w:val="22"/>
-              </w:rPr>
-              <w:t>.</w:t>
+              <w:t>PPK yang menerbitkan SPD, pegawai yang melakukan perjalanan dinas, para pejabat yang mengesahkan tanggal berangkat/tiba, serta bendahara pengeluaran bertanggung jawab berdasarkan peraturan-peraturan Keuangan Negara apabila negara menderita rugi akibat kesalahan, kelalaian, dan kealpaannya.</w:t>
             </w:r>
           </w:p>
           <w:p>
@@ -6674,6 +4685,7 @@
   <w:style w:type="character" w:default="1" w:styleId="DefaultParagraphFont">
     <w:name w:val="Default Paragraph Font"/>
     <w:uiPriority w:val="1"/>
+    <w:semiHidden/>
     <w:unhideWhenUsed/>
   </w:style>
   <w:style w:type="table" w:default="1" w:styleId="TableNormal">

</xml_diff>